<commit_message>
unit testing rest api and blender ep3
</commit_message>
<xml_diff>
--- a/Blender.docx
+++ b/Blender.docx
@@ -3975,6 +3975,7 @@
       <w:r>
         <w:rPr>
           <w:rFonts w:ascii="Lucida Console" w:hAnsi="Lucida Console"/>
+          <w:noProof/>
           <w:sz w:val="24"/>
         </w:rPr>
         <w:drawing>
@@ -4062,6 +4063,7 @@
       <w:r>
         <w:rPr>
           <w:rFonts w:ascii="Lucida Console" w:hAnsi="Lucida Console"/>
+          <w:noProof/>
           <w:sz w:val="24"/>
         </w:rPr>
         <w:drawing>
@@ -4141,6 +4143,7 @@
       <w:r>
         <w:rPr>
           <w:rFonts w:ascii="Lucida Console" w:hAnsi="Lucida Console"/>
+          <w:noProof/>
           <w:sz w:val="24"/>
         </w:rPr>
         <w:lastRenderedPageBreak/>
@@ -4303,6 +4306,7 @@
       <w:r>
         <w:rPr>
           <w:rFonts w:ascii="Lucida Console" w:hAnsi="Lucida Console"/>
+          <w:noProof/>
           <w:sz w:val="24"/>
         </w:rPr>
         <w:drawing>
@@ -4407,6 +4411,7 @@
       <w:r>
         <w:rPr>
           <w:rFonts w:ascii="Lucida Console" w:hAnsi="Lucida Console"/>
+          <w:noProof/>
           <w:sz w:val="24"/>
         </w:rPr>
         <w:drawing>
@@ -4525,6 +4530,7 @@
       <w:r>
         <w:rPr>
           <w:rFonts w:ascii="Lucida Console" w:hAnsi="Lucida Console"/>
+          <w:noProof/>
           <w:sz w:val="24"/>
         </w:rPr>
         <w:lastRenderedPageBreak/>
@@ -4578,6 +4584,324 @@
           <w:sz w:val="24"/>
         </w:rPr>
         <w:t>Dikdörtgensel duran dinazorun şekli üst köşeleri seçilerek (alt + sol tık) ve hem aşağı hem de yana edge slide (iki kere G) yapılarak yuvarlaklaştırılabilir (alt köşeye de yapılmalı).</w:t>
+      </w:r>
+    </w:p>
+    <w:p>
+      <w:pPr>
+        <w:rPr>
+          <w:rFonts w:ascii="Lucida Console" w:hAnsi="Lucida Console"/>
+          <w:sz w:val="24"/>
+        </w:rPr>
+      </w:pPr>
+    </w:p>
+    <w:p>
+      <w:pPr>
+        <w:rPr>
+          <w:rFonts w:ascii="Lucida Console" w:hAnsi="Lucida Console"/>
+          <w:sz w:val="24"/>
+        </w:rPr>
+      </w:pPr>
+    </w:p>
+    <w:p>
+      <w:pPr>
+        <w:rPr>
+          <w:rFonts w:ascii="Lucida Console" w:hAnsi="Lucida Console"/>
+          <w:b/>
+          <w:bCs/>
+          <w:sz w:val="24"/>
+        </w:rPr>
+      </w:pPr>
+      <w:r>
+        <w:rPr>
+          <w:rFonts w:ascii="Lucida Console" w:hAnsi="Lucida Console"/>
+          <w:b/>
+          <w:bCs/>
+          <w:sz w:val="24"/>
+        </w:rPr>
+        <w:t xml:space="preserve">Lesson.45 dino legs </w:t>
+      </w:r>
+    </w:p>
+    <w:p>
+      <w:pPr>
+        <w:rPr>
+          <w:rFonts w:ascii="Lucida Console" w:hAnsi="Lucida Console"/>
+          <w:b/>
+          <w:bCs/>
+          <w:sz w:val="24"/>
+        </w:rPr>
+      </w:pPr>
+    </w:p>
+    <w:p>
+      <w:pPr>
+        <w:rPr>
+          <w:rFonts w:ascii="Lucida Console" w:hAnsi="Lucida Console"/>
+          <w:sz w:val="24"/>
+        </w:rPr>
+      </w:pPr>
+      <w:r>
+        <w:rPr>
+          <w:rFonts w:ascii="Lucida Console" w:hAnsi="Lucida Console"/>
+          <w:sz w:val="24"/>
+        </w:rPr>
+        <w:t>I + B -&gt; inset, use boundary (yeni yüzü kenara yapıştırır)</w:t>
+      </w:r>
+    </w:p>
+    <w:p>
+      <w:pPr>
+        <w:rPr>
+          <w:rFonts w:ascii="Lucida Console" w:hAnsi="Lucida Console"/>
+          <w:sz w:val="24"/>
+        </w:rPr>
+      </w:pPr>
+    </w:p>
+    <w:p>
+      <w:pPr>
+        <w:rPr>
+          <w:rFonts w:ascii="Lucida Console" w:hAnsi="Lucida Console"/>
+          <w:sz w:val="24"/>
+        </w:rPr>
+      </w:pPr>
+      <w:r>
+        <w:rPr>
+          <w:rFonts w:ascii="Lucida Console" w:hAnsi="Lucida Console"/>
+          <w:sz w:val="24"/>
+        </w:rPr>
+        <w:t>I + I -&gt; indiviual insets açar kapatır</w:t>
+      </w:r>
+    </w:p>
+    <w:p>
+      <w:pPr>
+        <w:rPr>
+          <w:rFonts w:ascii="Lucida Console" w:hAnsi="Lucida Console"/>
+          <w:sz w:val="24"/>
+        </w:rPr>
+      </w:pPr>
+    </w:p>
+    <w:p>
+      <w:pPr>
+        <w:rPr>
+          <w:rFonts w:ascii="Lucida Console" w:hAnsi="Lucida Console"/>
+          <w:sz w:val="24"/>
+        </w:rPr>
+      </w:pPr>
+    </w:p>
+    <w:p>
+      <w:pPr>
+        <w:rPr>
+          <w:rFonts w:ascii="Lucida Console" w:hAnsi="Lucida Console"/>
+          <w:sz w:val="24"/>
+        </w:rPr>
+      </w:pPr>
+    </w:p>
+    <w:p>
+      <w:pPr>
+        <w:rPr>
+          <w:rFonts w:ascii="Lucida Console" w:hAnsi="Lucida Console"/>
+          <w:sz w:val="24"/>
+        </w:rPr>
+      </w:pPr>
+    </w:p>
+    <w:p>
+      <w:pPr>
+        <w:rPr>
+          <w:rFonts w:ascii="Lucida Console" w:hAnsi="Lucida Console"/>
+          <w:sz w:val="24"/>
+        </w:rPr>
+      </w:pPr>
+    </w:p>
+    <w:p>
+      <w:pPr>
+        <w:rPr>
+          <w:rFonts w:ascii="Lucida Console" w:hAnsi="Lucida Console"/>
+          <w:b/>
+          <w:bCs/>
+          <w:sz w:val="24"/>
+        </w:rPr>
+      </w:pPr>
+      <w:r>
+        <w:rPr>
+          <w:rFonts w:ascii="Lucida Console" w:hAnsi="Lucida Console"/>
+          <w:b/>
+          <w:bCs/>
+          <w:sz w:val="24"/>
+        </w:rPr>
+        <w:lastRenderedPageBreak/>
+        <w:t>lesson.48</w:t>
+      </w:r>
+      <w:r>
+        <w:rPr>
+          <w:rFonts w:ascii="Lucida Console" w:hAnsi="Lucida Console"/>
+          <w:b/>
+          <w:bCs/>
+          <w:sz w:val="24"/>
+        </w:rPr>
+        <w:t xml:space="preserve"> the</w:t>
+      </w:r>
+      <w:r>
+        <w:rPr>
+          <w:rFonts w:ascii="Lucida Console" w:hAnsi="Lucida Console"/>
+          <w:b/>
+          <w:bCs/>
+          <w:sz w:val="24"/>
+        </w:rPr>
+        <w:t xml:space="preserve"> </w:t>
+      </w:r>
+      <w:r>
+        <w:rPr>
+          <w:rFonts w:ascii="Lucida Console" w:hAnsi="Lucida Console"/>
+          <w:b/>
+          <w:bCs/>
+          <w:sz w:val="24"/>
+        </w:rPr>
+        <w:t>landscape</w:t>
+      </w:r>
+    </w:p>
+    <w:p>
+      <w:pPr>
+        <w:rPr>
+          <w:rFonts w:ascii="Lucida Console" w:hAnsi="Lucida Console"/>
+          <w:b/>
+          <w:bCs/>
+          <w:sz w:val="24"/>
+        </w:rPr>
+      </w:pPr>
+    </w:p>
+    <w:p>
+      <w:pPr>
+        <w:rPr>
+          <w:rFonts w:ascii="Lucida Console" w:hAnsi="Lucida Console"/>
+          <w:sz w:val="24"/>
+        </w:rPr>
+      </w:pPr>
+    </w:p>
+    <w:p>
+      <w:pPr>
+        <w:rPr>
+          <w:rFonts w:ascii="Lucida Console" w:hAnsi="Lucida Console"/>
+          <w:sz w:val="24"/>
+        </w:rPr>
+      </w:pPr>
+      <w:r>
+        <w:rPr>
+          <w:rFonts w:ascii="Lucida Console" w:hAnsi="Lucida Console"/>
+          <w:sz w:val="24"/>
+        </w:rPr>
+        <w:t>shading altında material nodes var</w:t>
+      </w:r>
+    </w:p>
+    <w:p>
+      <w:pPr>
+        <w:rPr>
+          <w:rFonts w:ascii="Lucida Console" w:hAnsi="Lucida Console"/>
+          <w:sz w:val="24"/>
+        </w:rPr>
+      </w:pPr>
+    </w:p>
+    <w:p>
+      <w:pPr>
+        <w:rPr>
+          <w:rFonts w:ascii="Lucida Console" w:hAnsi="Lucida Console"/>
+          <w:sz w:val="24"/>
+        </w:rPr>
+      </w:pPr>
+      <w:r>
+        <w:rPr>
+          <w:rFonts w:ascii="Lucida Console" w:hAnsi="Lucida Console"/>
+          <w:sz w:val="24"/>
+        </w:rPr>
+        <w:t>texture coordinate objenin hangi prosedüre göre texture alacağını ayarlar (default uv map)</w:t>
+      </w:r>
+    </w:p>
+    <w:p>
+      <w:pPr>
+        <w:rPr>
+          <w:rFonts w:ascii="Lucida Console" w:hAnsi="Lucida Console"/>
+          <w:sz w:val="24"/>
+        </w:rPr>
+      </w:pPr>
+    </w:p>
+    <w:p>
+      <w:pPr>
+        <w:rPr>
+          <w:rFonts w:ascii="Lucida Console" w:hAnsi="Lucida Console"/>
+          <w:sz w:val="24"/>
+        </w:rPr>
+      </w:pPr>
+      <w:r>
+        <w:rPr>
+          <w:rFonts w:ascii="Lucida Console" w:hAnsi="Lucida Console"/>
+          <w:sz w:val="24"/>
+        </w:rPr>
+        <w:t>node wrangler eklentisi kısayolları etkinleştirir</w:t>
+      </w:r>
+    </w:p>
+    <w:p>
+      <w:pPr>
+        <w:rPr>
+          <w:rFonts w:ascii="Lucida Console" w:hAnsi="Lucida Console"/>
+          <w:sz w:val="24"/>
+        </w:rPr>
+      </w:pPr>
+    </w:p>
+    <w:p>
+      <w:pPr>
+        <w:rPr>
+          <w:rFonts w:ascii="Lucida Console" w:hAnsi="Lucida Console"/>
+          <w:sz w:val="24"/>
+        </w:rPr>
+      </w:pPr>
+      <w:r>
+        <w:rPr>
+          <w:rFonts w:ascii="Lucida Console" w:hAnsi="Lucida Console"/>
+          <w:sz w:val="24"/>
+        </w:rPr>
+        <w:t>ctrl + shift + t -&gt; texture coordinate image texture nodelarını getirir</w:t>
+      </w:r>
+    </w:p>
+    <w:p>
+      <w:pPr>
+        <w:rPr>
+          <w:rFonts w:ascii="Lucida Console" w:hAnsi="Lucida Console"/>
+          <w:sz w:val="24"/>
+        </w:rPr>
+      </w:pPr>
+    </w:p>
+    <w:p>
+      <w:pPr>
+        <w:rPr>
+          <w:rFonts w:ascii="Lucida Console" w:hAnsi="Lucida Console"/>
+          <w:sz w:val="24"/>
+        </w:rPr>
+      </w:pPr>
+      <w:r>
+        <w:rPr>
+          <w:rFonts w:ascii="Lucida Console" w:hAnsi="Lucida Console"/>
+          <w:sz w:val="24"/>
+        </w:rPr>
+        <w:t>node üzerine ctrl + shift + sol tık: nodu direk görüntüye bağlar</w:t>
+      </w:r>
+    </w:p>
+    <w:p>
+      <w:pPr>
+        <w:rPr>
+          <w:rFonts w:ascii="Lucida Console" w:hAnsi="Lucida Console"/>
+          <w:sz w:val="24"/>
+        </w:rPr>
+      </w:pPr>
+    </w:p>
+    <w:p>
+      <w:pPr>
+        <w:rPr>
+          <w:rFonts w:ascii="Lucida Console" w:hAnsi="Lucida Console"/>
+          <w:sz w:val="24"/>
+        </w:rPr>
+      </w:pPr>
+      <w:r>
+        <w:rPr>
+          <w:rFonts w:ascii="Lucida Console" w:hAnsi="Lucida Console"/>
+          <w:sz w:val="24"/>
+        </w:rPr>
+        <w:t xml:space="preserve">texture coordinate – seperate xyz (z) – colorRamp – color bağlantısı ile objeye dikey gradient renk verebiliriz </w:t>
       </w:r>
     </w:p>
     <w:sectPr>

</xml_diff>